<commit_message>
Removed some components from website
</commit_message>
<xml_diff>
--- a/build/docs/CV.docx
+++ b/build/docs/CV.docx
@@ -330,24 +330,14 @@
           <w:sz w:val="20"/>
           <w:szCs w:val="20"/>
         </w:rPr>
-        <w:t xml:space="preserve">Tech </w:t>
-      </w:r>
-      <w:proofErr w:type="gramStart"/>
+        <w:t>Staff Engineer</w:t>
+      </w:r>
       <w:r>
         <w:rPr>
           <w:b/>
           <w:sz w:val="20"/>
           <w:szCs w:val="20"/>
         </w:rPr>
-        <w:t>Lead</w:t>
-      </w:r>
-      <w:proofErr w:type="gramEnd"/>
-      <w:r>
-        <w:rPr>
-          <w:b/>
-          <w:sz w:val="20"/>
-          <w:szCs w:val="20"/>
-        </w:rPr>
         <w:t xml:space="preserve"> </w:t>
       </w:r>
       <w:r>
@@ -429,6 +419,13 @@
           <w:szCs w:val="20"/>
         </w:rPr>
         <w:tab/>
+      </w:r>
+      <w:r>
+        <w:rPr>
+          <w:i/>
+          <w:sz w:val="20"/>
+          <w:szCs w:val="20"/>
+        </w:rPr>
         <w:t>Feb 22’ – Current</w:t>
       </w:r>
     </w:p>
@@ -455,14 +452,35 @@
           <w:sz w:val="20"/>
           <w:szCs w:val="20"/>
         </w:rPr>
-        <w:t>Lead</w:t>
-      </w:r>
-      <w:r>
-        <w:rPr>
-          <w:sz w:val="20"/>
-          <w:szCs w:val="20"/>
-        </w:rPr>
-        <w:t xml:space="preserve"> in the international expansion team at Robinhood – Built products for UK, Singapore</w:t>
+        <w:t>Technical lead for Cortex AI – Designed and built Robinhood</w:t>
+      </w:r>
+      <w:r>
+        <w:rPr>
+          <w:sz w:val="20"/>
+          <w:szCs w:val="20"/>
+        </w:rPr>
+        <w:t xml:space="preserve"> AI </w:t>
+      </w:r>
+      <w:r>
+        <w:rPr>
+          <w:sz w:val="20"/>
+          <w:szCs w:val="20"/>
+        </w:rPr>
+        <w:t xml:space="preserve">copilot products. “Digest” – LLM driven daily insights generation, “Trade generation” – ML models for generating trades for customers. </w:t>
+      </w:r>
+      <w:r>
+        <w:rPr>
+          <w:sz w:val="20"/>
+          <w:szCs w:val="20"/>
+        </w:rPr>
+        <w:br/>
+      </w:r>
+      <w:r>
+        <w:rPr>
+          <w:sz w:val="20"/>
+          <w:szCs w:val="20"/>
+        </w:rPr>
+        <w:t xml:space="preserve">Built E2E LLM capabilities – Tool calls, RAG, Evals, scaling the system to Robinhood’s 30 million users. </w:t>
       </w:r>
     </w:p>
     <w:p>
@@ -488,28 +506,35 @@
           <w:sz w:val="20"/>
           <w:szCs w:val="20"/>
         </w:rPr>
-        <w:t>Lead evolution of</w:t>
-      </w:r>
-      <w:r>
-        <w:rPr>
-          <w:sz w:val="20"/>
-          <w:szCs w:val="20"/>
-        </w:rPr>
-        <w:t xml:space="preserve"> Robinhood systems to support </w:t>
-      </w:r>
-      <w:r>
-        <w:rPr>
-          <w:sz w:val="20"/>
-          <w:szCs w:val="20"/>
-        </w:rPr>
-        <w:t>M</w:t>
-      </w:r>
-      <w:r>
-        <w:rPr>
-          <w:sz w:val="20"/>
-          <w:szCs w:val="20"/>
-        </w:rPr>
-        <w:t xml:space="preserve">ultiple countries, </w:t>
+        <w:t>Technical lead</w:t>
+      </w:r>
+      <w:r>
+        <w:rPr>
+          <w:sz w:val="20"/>
+          <w:szCs w:val="20"/>
+        </w:rPr>
+        <w:t xml:space="preserve"> in the international </w:t>
+      </w:r>
+      <w:r>
+        <w:rPr>
+          <w:sz w:val="20"/>
+          <w:szCs w:val="20"/>
+        </w:rPr>
+        <w:t xml:space="preserve">(UK, SG) </w:t>
+      </w:r>
+      <w:r>
+        <w:rPr>
+          <w:sz w:val="20"/>
+          <w:szCs w:val="20"/>
+        </w:rPr>
+        <w:t>expansion team at Robinhood –</w:t>
+      </w:r>
+      <w:r>
+        <w:rPr>
+          <w:sz w:val="20"/>
+          <w:szCs w:val="20"/>
+        </w:rPr>
+        <w:t xml:space="preserve"> Designed and built platform capabilities to accelerate internationalization: Forex trading, </w:t>
       </w:r>
       <w:r>
         <w:rPr>
@@ -523,14 +548,28 @@
           <w:sz w:val="20"/>
           <w:szCs w:val="20"/>
         </w:rPr>
-        <w:t xml:space="preserve"> </w:t>
-      </w:r>
-      <w:r>
-        <w:rPr>
-          <w:sz w:val="20"/>
-          <w:szCs w:val="20"/>
-        </w:rPr>
-        <w:t>ledgers: Creating a platform for the company to expand to new countries.</w:t>
+        <w:t xml:space="preserve"> ledgers, Payments, Options trading, </w:t>
+      </w:r>
+      <w:r>
+        <w:rPr>
+          <w:sz w:val="20"/>
+          <w:szCs w:val="20"/>
+        </w:rPr>
+        <w:t>Margin, Advanced</w:t>
+      </w:r>
+      <w:r>
+        <w:rPr>
+          <w:sz w:val="20"/>
+          <w:szCs w:val="20"/>
+        </w:rPr>
+        <w:t xml:space="preserve"> trading (OTO, OCO) </w:t>
+      </w:r>
+      <w:r>
+        <w:rPr>
+          <w:sz w:val="20"/>
+          <w:szCs w:val="20"/>
+        </w:rPr>
+        <w:t>orders.</w:t>
       </w:r>
     </w:p>
     <w:p>
@@ -556,7 +595,7 @@
           <w:sz w:val="20"/>
           <w:szCs w:val="20"/>
         </w:rPr>
-        <w:t xml:space="preserve">Designed and built Currency Exchange capabilities for Robinhood – Built a FX platform to power international products and FX trading. </w:t>
+        <w:t>Technical lead for Payment org – Built Debit card funding, Real time payments, Billing, ACH, Apple / Google play.</w:t>
       </w:r>
     </w:p>
     <w:p>
@@ -582,7 +621,21 @@
           <w:sz w:val="20"/>
           <w:szCs w:val="20"/>
         </w:rPr>
-        <w:t xml:space="preserve">DRI for building the Money Movement to power Robinhood’s international expansion to the United Kingdom. </w:t>
+        <w:t>Won award</w:t>
+      </w:r>
+      <w:r>
+        <w:rPr>
+          <w:sz w:val="20"/>
+          <w:szCs w:val="20"/>
+        </w:rPr>
+        <w:t xml:space="preserve">s for being a </w:t>
+      </w:r>
+      <w:r>
+        <w:rPr>
+          <w:sz w:val="20"/>
+          <w:szCs w:val="20"/>
+        </w:rPr>
+        <w:t>top performer - Founder’s awards (top 1%), Arrowhead award (Engineering excellence award).</w:t>
       </w:r>
     </w:p>
     <w:p>
@@ -608,7 +661,132 @@
           <w:sz w:val="20"/>
           <w:szCs w:val="20"/>
         </w:rPr>
-        <w:t>Won multiple awards being a top performer - Founder’s awards (top 1%), Arrowhead award (Engineering excellence award).</w:t>
+        <w:t xml:space="preserve">Tech: </w:t>
+      </w:r>
+      <w:r>
+        <w:rPr>
+          <w:sz w:val="20"/>
+          <w:szCs w:val="20"/>
+        </w:rPr>
+        <w:t xml:space="preserve">LLM, RAG, </w:t>
+      </w:r>
+      <w:r>
+        <w:rPr>
+          <w:sz w:val="20"/>
+          <w:szCs w:val="20"/>
+        </w:rPr>
+        <w:t xml:space="preserve">Python, Golang, Spark, </w:t>
+      </w:r>
+      <w:r>
+        <w:rPr>
+          <w:sz w:val="20"/>
+          <w:szCs w:val="20"/>
+        </w:rPr>
+        <w:t>TensorFlow</w:t>
+      </w:r>
+      <w:r>
+        <w:rPr>
+          <w:sz w:val="20"/>
+          <w:szCs w:val="20"/>
+        </w:rPr>
+        <w:t>, Kubernetes</w:t>
+      </w:r>
+    </w:p>
+    <w:p>
+      <w:pPr>
+        <w:rPr>
+          <w:i/>
+          <w:sz w:val="20"/>
+          <w:szCs w:val="20"/>
+        </w:rPr>
+      </w:pPr>
+      <w:r>
+        <w:rPr>
+          <w:b/>
+          <w:sz w:val="20"/>
+          <w:szCs w:val="20"/>
+        </w:rPr>
+        <w:t>Lead, Telemetry &amp; Capacity Planning</w:t>
+      </w:r>
+      <w:r>
+        <w:rPr>
+          <w:b/>
+          <w:sz w:val="20"/>
+          <w:szCs w:val="20"/>
+        </w:rPr>
+        <w:t xml:space="preserve"> </w:t>
+      </w:r>
+      <w:r>
+        <w:rPr>
+          <w:i/>
+          <w:sz w:val="20"/>
+          <w:szCs w:val="20"/>
+        </w:rPr>
+        <w:t xml:space="preserve">Google – San Francisco </w:t>
+      </w:r>
+      <w:r>
+        <w:rPr>
+          <w:i/>
+          <w:sz w:val="20"/>
+          <w:szCs w:val="20"/>
+        </w:rPr>
+        <w:tab/>
+      </w:r>
+      <w:r>
+        <w:rPr>
+          <w:i/>
+          <w:sz w:val="20"/>
+          <w:szCs w:val="20"/>
+        </w:rPr>
+        <w:tab/>
+      </w:r>
+      <w:r>
+        <w:rPr>
+          <w:i/>
+          <w:sz w:val="20"/>
+          <w:szCs w:val="20"/>
+        </w:rPr>
+        <w:tab/>
+      </w:r>
+      <w:r>
+        <w:rPr>
+          <w:i/>
+          <w:sz w:val="20"/>
+          <w:szCs w:val="20"/>
+        </w:rPr>
+        <w:tab/>
+      </w:r>
+      <w:r>
+        <w:rPr>
+          <w:i/>
+          <w:sz w:val="20"/>
+          <w:szCs w:val="20"/>
+        </w:rPr>
+        <w:tab/>
+      </w:r>
+      <w:r>
+        <w:rPr>
+          <w:i/>
+          <w:sz w:val="20"/>
+          <w:szCs w:val="20"/>
+        </w:rPr>
+        <w:tab/>
+      </w:r>
+      <w:r>
+        <w:rPr>
+          <w:i/>
+          <w:sz w:val="20"/>
+          <w:szCs w:val="20"/>
+        </w:rPr>
+        <w:tab/>
+      </w:r>
+      <w:r>
+        <w:rPr>
+          <w:i/>
+          <w:sz w:val="20"/>
+          <w:szCs w:val="20"/>
+        </w:rPr>
+        <w:t>Jan 21’ – Feb 22’</w:t>
       </w:r>
     </w:p>
     <w:p>
@@ -625,119 +803,26 @@
           <w:between w:val="nil"/>
         </w:pBdr>
         <w:rPr>
-          <w:sz w:val="20"/>
-          <w:szCs w:val="20"/>
-        </w:rPr>
-      </w:pPr>
-      <w:r>
-        <w:rPr>
-          <w:sz w:val="20"/>
-          <w:szCs w:val="20"/>
-        </w:rPr>
-        <w:t>Tech:</w:t>
-      </w:r>
-      <w:r>
-        <w:rPr>
-          <w:sz w:val="20"/>
-          <w:szCs w:val="20"/>
-        </w:rPr>
-        <w:t xml:space="preserve"> Python, Golang, Spark, </w:t>
-      </w:r>
-      <w:r>
-        <w:rPr>
-          <w:sz w:val="20"/>
-          <w:szCs w:val="20"/>
-        </w:rPr>
-        <w:t>TensorFlow</w:t>
-      </w:r>
-      <w:r>
-        <w:rPr>
-          <w:sz w:val="20"/>
-          <w:szCs w:val="20"/>
-        </w:rPr>
-        <w:t>, Kubernetes</w:t>
-      </w:r>
-    </w:p>
-    <w:p>
-      <w:pPr>
-        <w:rPr>
-          <w:i/>
-          <w:sz w:val="20"/>
-          <w:szCs w:val="20"/>
-        </w:rPr>
-      </w:pPr>
-      <w:r>
-        <w:rPr>
           <w:b/>
-          <w:sz w:val="20"/>
-          <w:szCs w:val="20"/>
-        </w:rPr>
-        <w:t xml:space="preserve">Lead, Telemetry &amp; Capacity Planning </w:t>
-      </w:r>
-      <w:r>
-        <w:rPr>
-          <w:i/>
-          <w:sz w:val="20"/>
-          <w:szCs w:val="20"/>
-        </w:rPr>
-        <w:t xml:space="preserve">Google – San Francisco </w:t>
-      </w:r>
-      <w:r>
-        <w:rPr>
-          <w:i/>
-          <w:sz w:val="20"/>
-          <w:szCs w:val="20"/>
-        </w:rPr>
-        <w:tab/>
-      </w:r>
-      <w:r>
-        <w:rPr>
-          <w:i/>
-          <w:sz w:val="20"/>
-          <w:szCs w:val="20"/>
-        </w:rPr>
-        <w:tab/>
-      </w:r>
-      <w:r>
-        <w:rPr>
-          <w:i/>
-          <w:sz w:val="20"/>
-          <w:szCs w:val="20"/>
-        </w:rPr>
-        <w:tab/>
-      </w:r>
-      <w:r>
-        <w:rPr>
-          <w:i/>
-          <w:sz w:val="20"/>
-          <w:szCs w:val="20"/>
-        </w:rPr>
-        <w:tab/>
-      </w:r>
-      <w:r>
-        <w:rPr>
-          <w:i/>
-          <w:sz w:val="20"/>
-          <w:szCs w:val="20"/>
-        </w:rPr>
-        <w:tab/>
-      </w:r>
-      <w:r>
-        <w:rPr>
-          <w:i/>
-          <w:sz w:val="20"/>
-          <w:szCs w:val="20"/>
-        </w:rPr>
-        <w:tab/>
-      </w:r>
-      <w:r>
-        <w:rPr>
-          <w:i/>
-          <w:sz w:val="20"/>
-          <w:szCs w:val="20"/>
-        </w:rPr>
-        <w:tab/>
-        <w:t>Jan 21’ – Feb 22’</w:t>
+          <w:color w:val="000000"/>
+          <w:sz w:val="20"/>
+          <w:szCs w:val="20"/>
+        </w:rPr>
+      </w:pPr>
+      <w:r>
+        <w:rPr>
+          <w:sz w:val="20"/>
+          <w:szCs w:val="20"/>
+        </w:rPr>
+        <w:t>Telemetry Lead</w:t>
+      </w:r>
+      <w:r>
+        <w:rPr>
+          <w:color w:val="000000"/>
+          <w:sz w:val="20"/>
+          <w:szCs w:val="20"/>
+        </w:rPr>
+        <w:t xml:space="preserve"> for Google Cloud Platform infrastructure capacity planning.</w:t>
       </w:r>
     </w:p>
     <w:p>
@@ -754,42 +839,6 @@
           <w:between w:val="nil"/>
         </w:pBdr>
         <w:rPr>
-          <w:b/>
-          <w:color w:val="000000"/>
-          <w:sz w:val="20"/>
-          <w:szCs w:val="20"/>
-        </w:rPr>
-      </w:pPr>
-      <w:r>
-        <w:rPr>
-          <w:sz w:val="20"/>
-          <w:szCs w:val="20"/>
-        </w:rPr>
-        <w:t>Telemetry Lead</w:t>
-      </w:r>
-      <w:r>
-        <w:rPr>
-          <w:color w:val="000000"/>
-          <w:sz w:val="20"/>
-          <w:szCs w:val="20"/>
-        </w:rPr>
-        <w:t xml:space="preserve"> for Google Cloud Platform infrastructure capacity planning.</w:t>
-      </w:r>
-    </w:p>
-    <w:p>
-      <w:pPr>
-        <w:numPr>
-          <w:ilvl w:val="0"/>
-          <w:numId w:val="1"/>
-        </w:numPr>
-        <w:pBdr>
-          <w:top w:val="nil"/>
-          <w:left w:val="nil"/>
-          <w:bottom w:val="nil"/>
-          <w:right w:val="nil"/>
-          <w:between w:val="nil"/>
-        </w:pBdr>
-        <w:rPr>
           <w:sz w:val="20"/>
           <w:szCs w:val="20"/>
         </w:rPr>
@@ -800,39 +849,6 @@
           <w:szCs w:val="20"/>
         </w:rPr>
         <w:t>Worked with cross-functional teams in GCS to create systems &amp; processes that ensure GCS disk infrastructure is optimal.</w:t>
-      </w:r>
-    </w:p>
-    <w:p>
-      <w:pPr>
-        <w:numPr>
-          <w:ilvl w:val="0"/>
-          <w:numId w:val="1"/>
-        </w:numPr>
-        <w:pBdr>
-          <w:top w:val="nil"/>
-          <w:left w:val="nil"/>
-          <w:bottom w:val="nil"/>
-          <w:right w:val="nil"/>
-          <w:between w:val="nil"/>
-        </w:pBdr>
-        <w:rPr>
-          <w:sz w:val="20"/>
-          <w:szCs w:val="20"/>
-        </w:rPr>
-      </w:pPr>
-      <w:r>
-        <w:rPr>
-          <w:sz w:val="20"/>
-          <w:szCs w:val="20"/>
-        </w:rPr>
-        <w:t>Tech:</w:t>
-      </w:r>
-      <w:r>
-        <w:rPr>
-          <w:sz w:val="20"/>
-          <w:szCs w:val="20"/>
-        </w:rPr>
-        <w:t xml:space="preserve"> C++, JAVA</w:t>
       </w:r>
     </w:p>
     <w:p>
@@ -942,7 +958,41 @@
           <w:sz w:val="20"/>
           <w:szCs w:val="20"/>
         </w:rPr>
-        <w:t xml:space="preserve"> and publishing numerous research papers in top conferences. </w:t>
+        <w:t xml:space="preserve"> and publishing research papers in top conferences</w:t>
+      </w:r>
+      <w:r>
+        <w:rPr>
+          <w:color w:val="000000"/>
+          <w:sz w:val="20"/>
+          <w:szCs w:val="20"/>
+        </w:rPr>
+        <w:t xml:space="preserve"> (ACM </w:t>
+      </w:r>
+      <w:proofErr w:type="spellStart"/>
+      <w:r>
+        <w:rPr>
+          <w:color w:val="000000"/>
+          <w:sz w:val="20"/>
+          <w:szCs w:val="20"/>
+        </w:rPr>
+        <w:t>MobiCom</w:t>
+      </w:r>
+      <w:proofErr w:type="spellEnd"/>
+      <w:r>
+        <w:rPr>
+          <w:color w:val="000000"/>
+          <w:sz w:val="20"/>
+          <w:szCs w:val="20"/>
+        </w:rPr>
+        <w:t>, IEEE TENCON)</w:t>
+      </w:r>
+      <w:r>
+        <w:rPr>
+          <w:color w:val="000000"/>
+          <w:sz w:val="20"/>
+          <w:szCs w:val="20"/>
+        </w:rPr>
+        <w:t xml:space="preserve">. </w:t>
       </w:r>
       <w:r>
         <w:rPr>
@@ -978,7 +1028,7 @@
           <w:sz w:val="20"/>
           <w:szCs w:val="20"/>
         </w:rPr>
-        <w:t xml:space="preserve">Worked in dynamic client facing teams - Played roles ranging from MLE, Full stack developer, </w:t>
+        <w:t xml:space="preserve">Worked in client facing teams - Played roles ranging from MLE, Full stack developer, </w:t>
       </w:r>
       <w:r>
         <w:rPr>
@@ -1410,7 +1460,23 @@
             <w:szCs w:val="20"/>
             <w:u w:val="single"/>
           </w:rPr>
-          <w:t>jaylohokare.com/research</w:t>
+          <w:t>jaylohokare.com/r</w:t>
+        </w:r>
+        <w:r>
+          <w:rPr>
+            <w:sz w:val="20"/>
+            <w:szCs w:val="20"/>
+            <w:u w:val="single"/>
+          </w:rPr>
+          <w:t>e</w:t>
+        </w:r>
+        <w:r>
+          <w:rPr>
+            <w:sz w:val="20"/>
+            <w:szCs w:val="20"/>
+            <w:u w:val="single"/>
+          </w:rPr>
+          <w:t>search</w:t>
         </w:r>
       </w:hyperlink>
       <w:r>
@@ -1634,18 +1700,18 @@
       </w:r>
       <w:r>
         <w:rPr>
+          <w:sz w:val="20"/>
+          <w:szCs w:val="20"/>
+        </w:rPr>
+        <w:t xml:space="preserve">        </w:t>
+      </w:r>
+      <w:r>
+        <w:rPr>
           <w:i/>
           <w:sz w:val="20"/>
           <w:szCs w:val="20"/>
         </w:rPr>
         <w:t>State University of New York Stony Brook</w:t>
-      </w:r>
-      <w:r>
-        <w:rPr>
-          <w:sz w:val="20"/>
-          <w:szCs w:val="20"/>
-        </w:rPr>
-        <w:tab/>
       </w:r>
     </w:p>
     <w:p>
@@ -1736,25 +1802,6 @@
           <w:sz w:val="20"/>
           <w:szCs w:val="20"/>
         </w:rPr>
-        <w:t>Designed and implemented an open-source cryptocurrency trading system which would later be used by Uptick (https://uptick.co/) to build their commercial platform (formerly daix.io)</w:t>
-      </w:r>
-    </w:p>
-    <w:p>
-      <w:pPr>
-        <w:numPr>
-          <w:ilvl w:val="0"/>
-          <w:numId w:val="1"/>
-        </w:numPr>
-        <w:rPr>
-          <w:sz w:val="20"/>
-          <w:szCs w:val="20"/>
-        </w:rPr>
-      </w:pPr>
-      <w:r>
-        <w:rPr>
-          <w:sz w:val="20"/>
-          <w:szCs w:val="20"/>
-        </w:rPr>
         <w:t>Designed and implemented an innovative insurance platform based on blockchain, which was adopted and commercialized by Belt lacer (https://www.beltlacer.com/)</w:t>
       </w:r>
     </w:p>
@@ -1779,6 +1826,13 @@
           <w:szCs w:val="20"/>
         </w:rPr>
         <w:t xml:space="preserve"> </w:t>
+      </w:r>
+      <w:r>
+        <w:rPr>
+          <w:sz w:val="20"/>
+          <w:szCs w:val="20"/>
+        </w:rPr>
+        <w:tab/>
       </w:r>
       <w:r>
         <w:rPr>
@@ -1978,6 +2032,118 @@
     </w:lvl>
   </w:abstractNum>
   <w:abstractNum w:abstractNumId="1" w15:restartNumberingAfterBreak="0">
+    <w:nsid w:val="0989733A"/>
+    <w:multiLevelType w:val="hybridMultilevel"/>
+    <w:tmpl w:val="E640E674"/>
+    <w:lvl w:ilvl="0" w:tplc="7A72DBA4">
+      <w:numFmt w:val="bullet"/>
+      <w:lvlText w:val="-"/>
+      <w:lvlJc w:val="left"/>
+      <w:pPr>
+        <w:ind w:left="720" w:hanging="360"/>
+      </w:pPr>
+      <w:rPr>
+        <w:rFonts w:ascii="Calibri" w:eastAsia="Calibri" w:hAnsi="Calibri" w:cs="Calibri" w:hint="default"/>
+      </w:rPr>
+    </w:lvl>
+    <w:lvl w:ilvl="1" w:tplc="04090003" w:tentative="1">
+      <w:start w:val="1"/>
+      <w:numFmt w:val="bullet"/>
+      <w:lvlText w:val="o"/>
+      <w:lvlJc w:val="left"/>
+      <w:pPr>
+        <w:ind w:left="1440" w:hanging="360"/>
+      </w:pPr>
+      <w:rPr>
+        <w:rFonts w:ascii="Courier New" w:hAnsi="Courier New" w:cs="Courier New" w:hint="default"/>
+      </w:rPr>
+    </w:lvl>
+    <w:lvl w:ilvl="2" w:tplc="04090005" w:tentative="1">
+      <w:start w:val="1"/>
+      <w:numFmt w:val="bullet"/>
+      <w:lvlText w:val=""/>
+      <w:lvlJc w:val="left"/>
+      <w:pPr>
+        <w:ind w:left="2160" w:hanging="360"/>
+      </w:pPr>
+      <w:rPr>
+        <w:rFonts w:ascii="Wingdings" w:hAnsi="Wingdings" w:hint="default"/>
+      </w:rPr>
+    </w:lvl>
+    <w:lvl w:ilvl="3" w:tplc="04090001" w:tentative="1">
+      <w:start w:val="1"/>
+      <w:numFmt w:val="bullet"/>
+      <w:lvlText w:val=""/>
+      <w:lvlJc w:val="left"/>
+      <w:pPr>
+        <w:ind w:left="2880" w:hanging="360"/>
+      </w:pPr>
+      <w:rPr>
+        <w:rFonts w:ascii="Symbol" w:hAnsi="Symbol" w:hint="default"/>
+      </w:rPr>
+    </w:lvl>
+    <w:lvl w:ilvl="4" w:tplc="04090003" w:tentative="1">
+      <w:start w:val="1"/>
+      <w:numFmt w:val="bullet"/>
+      <w:lvlText w:val="o"/>
+      <w:lvlJc w:val="left"/>
+      <w:pPr>
+        <w:ind w:left="3600" w:hanging="360"/>
+      </w:pPr>
+      <w:rPr>
+        <w:rFonts w:ascii="Courier New" w:hAnsi="Courier New" w:cs="Courier New" w:hint="default"/>
+      </w:rPr>
+    </w:lvl>
+    <w:lvl w:ilvl="5" w:tplc="04090005" w:tentative="1">
+      <w:start w:val="1"/>
+      <w:numFmt w:val="bullet"/>
+      <w:lvlText w:val=""/>
+      <w:lvlJc w:val="left"/>
+      <w:pPr>
+        <w:ind w:left="4320" w:hanging="360"/>
+      </w:pPr>
+      <w:rPr>
+        <w:rFonts w:ascii="Wingdings" w:hAnsi="Wingdings" w:hint="default"/>
+      </w:rPr>
+    </w:lvl>
+    <w:lvl w:ilvl="6" w:tplc="04090001" w:tentative="1">
+      <w:start w:val="1"/>
+      <w:numFmt w:val="bullet"/>
+      <w:lvlText w:val=""/>
+      <w:lvlJc w:val="left"/>
+      <w:pPr>
+        <w:ind w:left="5040" w:hanging="360"/>
+      </w:pPr>
+      <w:rPr>
+        <w:rFonts w:ascii="Symbol" w:hAnsi="Symbol" w:hint="default"/>
+      </w:rPr>
+    </w:lvl>
+    <w:lvl w:ilvl="7" w:tplc="04090003" w:tentative="1">
+      <w:start w:val="1"/>
+      <w:numFmt w:val="bullet"/>
+      <w:lvlText w:val="o"/>
+      <w:lvlJc w:val="left"/>
+      <w:pPr>
+        <w:ind w:left="5760" w:hanging="360"/>
+      </w:pPr>
+      <w:rPr>
+        <w:rFonts w:ascii="Courier New" w:hAnsi="Courier New" w:cs="Courier New" w:hint="default"/>
+      </w:rPr>
+    </w:lvl>
+    <w:lvl w:ilvl="8" w:tplc="04090005" w:tentative="1">
+      <w:start w:val="1"/>
+      <w:numFmt w:val="bullet"/>
+      <w:lvlText w:val=""/>
+      <w:lvlJc w:val="left"/>
+      <w:pPr>
+        <w:ind w:left="6480" w:hanging="360"/>
+      </w:pPr>
+      <w:rPr>
+        <w:rFonts w:ascii="Wingdings" w:hAnsi="Wingdings" w:hint="default"/>
+      </w:rPr>
+    </w:lvl>
+  </w:abstractNum>
+  <w:abstractNum w:abstractNumId="2" w15:restartNumberingAfterBreak="0">
     <w:nsid w:val="0D966C7F"/>
     <w:multiLevelType w:val="multilevel"/>
     <w:tmpl w:val="10806158"/>
@@ -2090,7 +2256,119 @@
       </w:rPr>
     </w:lvl>
   </w:abstractNum>
-  <w:abstractNum w:abstractNumId="2" w15:restartNumberingAfterBreak="0">
+  <w:abstractNum w:abstractNumId="3" w15:restartNumberingAfterBreak="0">
+    <w:nsid w:val="32E25848"/>
+    <w:multiLevelType w:val="hybridMultilevel"/>
+    <w:tmpl w:val="35C89404"/>
+    <w:lvl w:ilvl="0" w:tplc="3C829E38">
+      <w:numFmt w:val="bullet"/>
+      <w:lvlText w:val="-"/>
+      <w:lvlJc w:val="left"/>
+      <w:pPr>
+        <w:ind w:left="720" w:hanging="360"/>
+      </w:pPr>
+      <w:rPr>
+        <w:rFonts w:ascii="Calibri" w:eastAsia="Calibri" w:hAnsi="Calibri" w:cs="Calibri" w:hint="default"/>
+      </w:rPr>
+    </w:lvl>
+    <w:lvl w:ilvl="1" w:tplc="04090003" w:tentative="1">
+      <w:start w:val="1"/>
+      <w:numFmt w:val="bullet"/>
+      <w:lvlText w:val="o"/>
+      <w:lvlJc w:val="left"/>
+      <w:pPr>
+        <w:ind w:left="1440" w:hanging="360"/>
+      </w:pPr>
+      <w:rPr>
+        <w:rFonts w:ascii="Courier New" w:hAnsi="Courier New" w:cs="Courier New" w:hint="default"/>
+      </w:rPr>
+    </w:lvl>
+    <w:lvl w:ilvl="2" w:tplc="04090005" w:tentative="1">
+      <w:start w:val="1"/>
+      <w:numFmt w:val="bullet"/>
+      <w:lvlText w:val=""/>
+      <w:lvlJc w:val="left"/>
+      <w:pPr>
+        <w:ind w:left="2160" w:hanging="360"/>
+      </w:pPr>
+      <w:rPr>
+        <w:rFonts w:ascii="Wingdings" w:hAnsi="Wingdings" w:hint="default"/>
+      </w:rPr>
+    </w:lvl>
+    <w:lvl w:ilvl="3" w:tplc="04090001" w:tentative="1">
+      <w:start w:val="1"/>
+      <w:numFmt w:val="bullet"/>
+      <w:lvlText w:val=""/>
+      <w:lvlJc w:val="left"/>
+      <w:pPr>
+        <w:ind w:left="2880" w:hanging="360"/>
+      </w:pPr>
+      <w:rPr>
+        <w:rFonts w:ascii="Symbol" w:hAnsi="Symbol" w:hint="default"/>
+      </w:rPr>
+    </w:lvl>
+    <w:lvl w:ilvl="4" w:tplc="04090003" w:tentative="1">
+      <w:start w:val="1"/>
+      <w:numFmt w:val="bullet"/>
+      <w:lvlText w:val="o"/>
+      <w:lvlJc w:val="left"/>
+      <w:pPr>
+        <w:ind w:left="3600" w:hanging="360"/>
+      </w:pPr>
+      <w:rPr>
+        <w:rFonts w:ascii="Courier New" w:hAnsi="Courier New" w:cs="Courier New" w:hint="default"/>
+      </w:rPr>
+    </w:lvl>
+    <w:lvl w:ilvl="5" w:tplc="04090005" w:tentative="1">
+      <w:start w:val="1"/>
+      <w:numFmt w:val="bullet"/>
+      <w:lvlText w:val=""/>
+      <w:lvlJc w:val="left"/>
+      <w:pPr>
+        <w:ind w:left="4320" w:hanging="360"/>
+      </w:pPr>
+      <w:rPr>
+        <w:rFonts w:ascii="Wingdings" w:hAnsi="Wingdings" w:hint="default"/>
+      </w:rPr>
+    </w:lvl>
+    <w:lvl w:ilvl="6" w:tplc="04090001" w:tentative="1">
+      <w:start w:val="1"/>
+      <w:numFmt w:val="bullet"/>
+      <w:lvlText w:val=""/>
+      <w:lvlJc w:val="left"/>
+      <w:pPr>
+        <w:ind w:left="5040" w:hanging="360"/>
+      </w:pPr>
+      <w:rPr>
+        <w:rFonts w:ascii="Symbol" w:hAnsi="Symbol" w:hint="default"/>
+      </w:rPr>
+    </w:lvl>
+    <w:lvl w:ilvl="7" w:tplc="04090003" w:tentative="1">
+      <w:start w:val="1"/>
+      <w:numFmt w:val="bullet"/>
+      <w:lvlText w:val="o"/>
+      <w:lvlJc w:val="left"/>
+      <w:pPr>
+        <w:ind w:left="5760" w:hanging="360"/>
+      </w:pPr>
+      <w:rPr>
+        <w:rFonts w:ascii="Courier New" w:hAnsi="Courier New" w:cs="Courier New" w:hint="default"/>
+      </w:rPr>
+    </w:lvl>
+    <w:lvl w:ilvl="8" w:tplc="04090005" w:tentative="1">
+      <w:start w:val="1"/>
+      <w:numFmt w:val="bullet"/>
+      <w:lvlText w:val=""/>
+      <w:lvlJc w:val="left"/>
+      <w:pPr>
+        <w:ind w:left="6480" w:hanging="360"/>
+      </w:pPr>
+      <w:rPr>
+        <w:rFonts w:ascii="Wingdings" w:hAnsi="Wingdings" w:hint="default"/>
+      </w:rPr>
+    </w:lvl>
+  </w:abstractNum>
+  <w:abstractNum w:abstractNumId="4" w15:restartNumberingAfterBreak="0">
     <w:nsid w:val="465156D3"/>
     <w:multiLevelType w:val="multilevel"/>
     <w:tmpl w:val="53125146"/>
@@ -2202,7 +2480,7 @@
       </w:rPr>
     </w:lvl>
   </w:abstractNum>
-  <w:abstractNum w:abstractNumId="3" w15:restartNumberingAfterBreak="0">
+  <w:abstractNum w:abstractNumId="5" w15:restartNumberingAfterBreak="0">
     <w:nsid w:val="4B4A1BDB"/>
     <w:multiLevelType w:val="multilevel"/>
     <w:tmpl w:val="A5A680C0"/>
@@ -2316,16 +2594,22 @@
     </w:lvl>
   </w:abstractNum>
   <w:num w:numId="1" w16cid:durableId="2066023702">
-    <w:abstractNumId w:val="2"/>
+    <w:abstractNumId w:val="4"/>
   </w:num>
   <w:num w:numId="2" w16cid:durableId="1185053081">
-    <w:abstractNumId w:val="3"/>
+    <w:abstractNumId w:val="5"/>
   </w:num>
   <w:num w:numId="3" w16cid:durableId="1312441425">
     <w:abstractNumId w:val="0"/>
   </w:num>
   <w:num w:numId="4" w16cid:durableId="2109352543">
+    <w:abstractNumId w:val="2"/>
+  </w:num>
+  <w:num w:numId="5" w16cid:durableId="1535117226">
     <w:abstractNumId w:val="1"/>
+  </w:num>
+  <w:num w:numId="6" w16cid:durableId="734428685">
+    <w:abstractNumId w:val="3"/>
   </w:num>
 </w:numbering>
 </file>
@@ -2904,6 +3188,40 @@
       <w:szCs w:val="48"/>
     </w:rPr>
   </w:style>
+  <w:style w:type="character" w:styleId="Hyperlink">
+    <w:name w:val="Hyperlink"/>
+    <w:basedOn w:val="DefaultParagraphFont"/>
+    <w:uiPriority w:val="99"/>
+    <w:unhideWhenUsed/>
+    <w:rsid w:val="00FE1D52"/>
+    <w:rPr>
+      <w:color w:val="0000FF" w:themeColor="hyperlink"/>
+      <w:u w:val="single"/>
+    </w:rPr>
+  </w:style>
+  <w:style w:type="character" w:styleId="UnresolvedMention">
+    <w:name w:val="Unresolved Mention"/>
+    <w:basedOn w:val="DefaultParagraphFont"/>
+    <w:uiPriority w:val="99"/>
+    <w:semiHidden/>
+    <w:unhideWhenUsed/>
+    <w:rsid w:val="00FE1D52"/>
+    <w:rPr>
+      <w:color w:val="605E5C"/>
+      <w:shd w:val="clear" w:color="auto" w:fill="E1DFDD"/>
+    </w:rPr>
+  </w:style>
+  <w:style w:type="paragraph" w:styleId="ListParagraph">
+    <w:name w:val="List Paragraph"/>
+    <w:basedOn w:val="Normal"/>
+    <w:uiPriority w:val="34"/>
+    <w:qFormat/>
+    <w:rsid w:val="00892994"/>
+    <w:pPr>
+      <w:ind w:left="720"/>
+      <w:contextualSpacing/>
+    </w:pPr>
+  </w:style>
 </w:styles>
 </file>
 

</xml_diff>